<commit_message>
AMS grad - non convergence
</commit_message>
<xml_diff>
--- a/docs/August research.docx
+++ b/docs/August research.docx
@@ -260,27 +260,7 @@
           <w:szCs w:val="36"/>
         </w:rPr>
         <w:lastRenderedPageBreak/>
-        <w:t>Double Gradient Descent (</w:t>
-      </w:r>
-      <w:proofErr w:type="spellStart"/>
-      <w:r>
-        <w:rPr>
-          <w:b/>
-          <w:bCs/>
-          <w:sz w:val="30"/>
-          <w:szCs w:val="36"/>
-        </w:rPr>
-        <w:t>Hypergradient</w:t>
-      </w:r>
-      <w:proofErr w:type="spellEnd"/>
-      <w:r>
-        <w:rPr>
-          <w:b/>
-          <w:bCs/>
-          <w:sz w:val="30"/>
-          <w:szCs w:val="36"/>
-        </w:rPr>
-        <w:t xml:space="preserve"> Descent)</w:t>
+        <w:t>Double Gradient Descent (Hypergradient Descent)</w:t>
       </w:r>
     </w:p>
     <w:p>
@@ -303,52 +283,19 @@
         <w:t>but also with respect to the learning rate</w:t>
       </w:r>
       <w:r>
-        <w:t xml:space="preserve"> α itself. This "gradient of a gradient" is called a </w:t>
-      </w:r>
-      <w:proofErr w:type="spellStart"/>
-      <w:r>
-        <w:t>hypergradient</w:t>
-      </w:r>
-      <w:proofErr w:type="spellEnd"/>
-      <w:r>
-        <w:t>.</w:t>
+        <w:t xml:space="preserve"> α itself. This "gradient of a gradient" is called a hypergradient.</w:t>
       </w:r>
     </w:p>
     <w:p>
       <w:r>
         <w:t>Using the paper [</w:t>
       </w:r>
-      <w:proofErr w:type="spellStart"/>
-      <w:r>
-        <w:rPr>
-          <w:b/>
-          <w:bCs/>
-        </w:rPr>
-        <w:t>Baydin</w:t>
-      </w:r>
-      <w:proofErr w:type="spellEnd"/>
-      <w:r>
-        <w:rPr>
-          <w:b/>
-          <w:bCs/>
-        </w:rPr>
-        <w:t xml:space="preserve"> et al., "Online Learning Rate Adaptation with </w:t>
-      </w:r>
-      <w:proofErr w:type="spellStart"/>
-      <w:r>
-        <w:rPr>
-          <w:b/>
-          <w:bCs/>
-        </w:rPr>
-        <w:t>Hypergradient</w:t>
-      </w:r>
-      <w:proofErr w:type="spellEnd"/>
-      <w:r>
-        <w:rPr>
-          <w:b/>
-          <w:bCs/>
-        </w:rPr>
-        <w:t xml:space="preserve"> Descent" (2018), ICLR</w:t>
+      <w:r>
+        <w:rPr>
+          <w:b/>
+          <w:bCs/>
+        </w:rPr>
+        <w:t>Baydin et al., "Online Learning Rate Adaptation with Hypergradient Descent" (2018), ICLR</w:t>
       </w:r>
       <w:r>
         <w:t>]</w:t>
@@ -973,23 +920,7 @@
     <w:p>
       <w:r>
         <w:lastRenderedPageBreak/>
-        <w:t xml:space="preserve">∂f/∂xᵢ ≈ (f(x + </w:t>
-      </w:r>
-      <w:proofErr w:type="spellStart"/>
-      <w:r>
-        <w:t>εe</w:t>
-      </w:r>
-      <w:proofErr w:type="spellEnd"/>
-      <w:r>
-        <w:t xml:space="preserve">ᵢ) − f(x − </w:t>
-      </w:r>
-      <w:proofErr w:type="spellStart"/>
-      <w:r>
-        <w:t>εe</w:t>
-      </w:r>
-      <w:proofErr w:type="spellEnd"/>
-      <w:r>
-        <w:t>ᵢ)) / 2ε</w:t>
+        <w:t>∂f/∂xᵢ ≈ (f(x + εeᵢ) − f(x − εeᵢ)) / 2ε</w:t>
       </w:r>
     </w:p>
     <w:p>
@@ -1029,23 +960,7 @@
     </w:p>
     <w:p>
       <w:r>
-        <w:t xml:space="preserve">ĝ ≈ (f(x + </w:t>
-      </w:r>
-      <w:proofErr w:type="spellStart"/>
-      <w:r>
-        <w:t>εΔ</w:t>
-      </w:r>
-      <w:proofErr w:type="spellEnd"/>
-      <w:r>
-        <w:t xml:space="preserve">) − f(x − </w:t>
-      </w:r>
-      <w:proofErr w:type="spellStart"/>
-      <w:r>
-        <w:t>εΔ</w:t>
-      </w:r>
-      <w:proofErr w:type="spellEnd"/>
-      <w:r>
-        <w:t>)) / 2ε · Δ⁻¹</w:t>
+        <w:t>ĝ ≈ (f(x + εΔ) − f(x − εΔ)) / 2ε · Δ⁻¹</w:t>
       </w:r>
     </w:p>
     <w:p>
@@ -1064,14 +979,12 @@
       <w:r>
         <w:t xml:space="preserve"> A trick where you evaluate f(x + </w:t>
       </w:r>
-      <w:proofErr w:type="spellStart"/>
       <w:r>
         <w:rPr>
           <w:highlight w:val="yellow"/>
         </w:rPr>
         <w:t>ih</w:t>
       </w:r>
-      <w:proofErr w:type="spellEnd"/>
       <w:r>
         <w:t xml:space="preserve">) with a </w:t>
       </w:r>
@@ -1333,23 +1246,22 @@
           <w:sz w:val="20"/>
           <w:szCs w:val="20"/>
         </w:rPr>
-        <w:t xml:space="preserve">or in </w:t>
-      </w:r>
-      <w:proofErr w:type="spellStart"/>
-      <w:r>
+        <w:t>or in matlab as :</w:t>
+      </w:r>
+    </w:p>
+    <w:p>
+      <w:pPr>
         <w:rPr>
           <w:sz w:val="20"/>
           <w:szCs w:val="20"/>
         </w:rPr>
-        <w:t>matlab</w:t>
-      </w:r>
-      <w:proofErr w:type="spellEnd"/>
+      </w:pPr>
       <w:r>
         <w:rPr>
           <w:sz w:val="20"/>
           <w:szCs w:val="20"/>
         </w:rPr>
-        <w:t xml:space="preserve"> as :</w:t>
+        <w:t xml:space="preserve"> w = w - alpha * m_hat ./ (sqrt(v_hat) + epsilon) - alpha * lambda * w;</w:t>
       </w:r>
     </w:p>
     <w:p>
@@ -1359,44 +1271,126 @@
           <w:szCs w:val="20"/>
         </w:rPr>
       </w:pPr>
-      <w:r>
-        <w:rPr>
-          <w:sz w:val="20"/>
-          <w:szCs w:val="20"/>
-        </w:rPr>
-        <w:t xml:space="preserve"> w = w - alpha * </w:t>
-      </w:r>
-      <w:proofErr w:type="spellStart"/>
-      <w:r>
-        <w:rPr>
-          <w:sz w:val="20"/>
-          <w:szCs w:val="20"/>
-        </w:rPr>
-        <w:t>m_hat</w:t>
-      </w:r>
-      <w:proofErr w:type="spellEnd"/>
-      <w:r>
-        <w:rPr>
-          <w:sz w:val="20"/>
-          <w:szCs w:val="20"/>
-        </w:rPr>
-        <w:t xml:space="preserve"> ./ (sqrt(</w:t>
-      </w:r>
-      <w:proofErr w:type="spellStart"/>
-      <w:r>
-        <w:rPr>
-          <w:sz w:val="20"/>
-          <w:szCs w:val="20"/>
-        </w:rPr>
-        <w:t>v_hat</w:t>
-      </w:r>
-      <w:proofErr w:type="spellEnd"/>
-      <w:r>
-        <w:rPr>
-          <w:sz w:val="20"/>
-          <w:szCs w:val="20"/>
-        </w:rPr>
-        <w:t>) + epsilon) - alpha * lambda * w;</w:t>
+    </w:p>
+    <w:p>
+      <w:pPr>
+        <w:rPr>
+          <w:b/>
+          <w:bCs/>
+        </w:rPr>
+      </w:pPr>
+      <w:r>
+        <w:rPr>
+          <w:b/>
+          <w:bCs/>
+        </w:rPr>
+        <w:lastRenderedPageBreak/>
+        <w:t>AMSGrad</w:t>
+      </w:r>
+      <w:r>
+        <w:rPr>
+          <w:b/>
+          <w:bCs/>
+        </w:rPr>
+        <w:t xml:space="preserve"> (</w:t>
+      </w:r>
+      <w:r>
+        <w:rPr>
+          <w:b/>
+          <w:bCs/>
+        </w:rPr>
+        <w:t>Fix the Non-Convergence</w:t>
+      </w:r>
+      <w:r>
+        <w:rPr>
+          <w:b/>
+          <w:bCs/>
+        </w:rPr>
+        <w:t>)</w:t>
+      </w:r>
+    </w:p>
+    <w:p>
+      <w:r>
+        <w:t xml:space="preserve">Several recently proposed stochastic optimization methods that have been successfully used in training deep networks such as RMSPROP, </w:t>
+      </w:r>
+      <w:r>
+        <w:rPr>
+          <w:b/>
+          <w:bCs/>
+        </w:rPr>
+        <w:t>ADAM</w:t>
+      </w:r>
+      <w:r>
+        <w:t>, ADADELTA, NADAM are based on using gradient updates scaled by square roots of exponential moving averages of squared past gradients. In many applications, e.g. learning with large output spaces, it has been empirically observed that these algorithms fail to converge to an optimal solution (or a critical point in nonconvex settings).</w:t>
+      </w:r>
+    </w:p>
+    <w:p>
+      <w:r>
+        <w:t xml:space="preserve">Although ADAGRAD works well for sparse settings, </w:t>
+      </w:r>
+      <w:r>
+        <w:rPr>
+          <w:b/>
+          <w:bCs/>
+        </w:rPr>
+        <w:t xml:space="preserve">its performance has been observed to deteriorate in settings where the loss functions are </w:t>
+      </w:r>
+      <w:r>
+        <w:rPr>
+          <w:b/>
+          <w:bCs/>
+        </w:rPr>
+        <w:t>nonconvex</w:t>
+      </w:r>
+      <w:r>
+        <w:t>,</w:t>
+      </w:r>
+      <w:r>
+        <w:t xml:space="preserve"> and gradients are dense due to rapid decay of the learning rate in these settings since </w:t>
+      </w:r>
+      <w:r>
+        <w:rPr>
+          <w:b/>
+          <w:bCs/>
+        </w:rPr>
+        <w:t>it uses all the past gradients in the update</w:t>
+      </w:r>
+      <w:r>
+        <w:t xml:space="preserve">. This problem is especially exacerbated in high dimensional problems arising in deep learning. To tackle this issue, several variants of ADAGRAD, such as RMSPROP (Tieleman &amp; Hinton, 2012), </w:t>
+      </w:r>
+      <w:r>
+        <w:rPr>
+          <w:b/>
+          <w:bCs/>
+          <w:highlight w:val="yellow"/>
+        </w:rPr>
+        <w:t>ADAM</w:t>
+      </w:r>
+      <w:r>
+        <w:rPr>
+          <w:b/>
+          <w:bCs/>
+        </w:rPr>
+        <w:t xml:space="preserve"> </w:t>
+      </w:r>
+      <w:r>
+        <w:t>(Kingma &amp; Ba, 2015), ADADELTA (Zeiler, 2012), NADAM (Dozat, 2016), etc, have been proposed which mitigate the rapid decay of the learning rate using the exponential moving averages of squared past gradients, essentially limiting the reliance of the update to only the past few gradients.</w:t>
+      </w:r>
+    </w:p>
+    <w:p>
+      <w:r>
+        <w:t>Adam updates its second moment estimate using an exponential moving average of past squared gradients. AMSGrad takes the maximum of the current squared gradient and the previous maximum squared gradient</w:t>
+      </w:r>
+      <w:r>
+        <w:t>.</w:t>
+      </w:r>
+    </w:p>
+    <w:p>
+      <w:r>
+        <w:t>Adam can occasionally have increasing or fluctuating effective learning rates that cause it to miss optimal points on certain convex functions. AMSGrad guarantees that the effective learning rate is strictly non-increasing</w:t>
+      </w:r>
+      <w:r>
+        <w:t>.</w:t>
       </w:r>
     </w:p>
     <w:p>
@@ -1405,22 +1399,8 @@
       </w:r>
     </w:p>
     <w:p>
-      <w:proofErr w:type="spellStart"/>
-      <w:r>
-        <w:lastRenderedPageBreak/>
-        <w:t>Baydin</w:t>
-      </w:r>
-      <w:proofErr w:type="spellEnd"/>
-      <w:r>
-        <w:t xml:space="preserve"> et al., "Online Learning Rate Adaptation with </w:t>
-      </w:r>
-      <w:proofErr w:type="spellStart"/>
-      <w:r>
-        <w:t>Hypergradient</w:t>
-      </w:r>
-      <w:proofErr w:type="spellEnd"/>
-      <w:r>
-        <w:t xml:space="preserve"> Descent" (2018)</w:t>
+      <w:r>
+        <w:t>Baydin et al., "Online Learning Rate Adaptation with Hypergradient Descent" (2018)</w:t>
       </w:r>
     </w:p>
     <w:p>
@@ -1455,26 +1435,42 @@
           <w:b/>
           <w:bCs/>
         </w:rPr>
-        <w:t> [</w:t>
-      </w:r>
-      <w:proofErr w:type="spellStart"/>
-      <w:r>
-        <w:rPr>
-          <w:b/>
-          <w:bCs/>
-        </w:rPr>
-        <w:t>cs.LG</w:t>
-      </w:r>
-      <w:proofErr w:type="spellEnd"/>
-      <w:r>
-        <w:rPr>
-          <w:b/>
-          <w:bCs/>
-        </w:rPr>
-        <w:t>]</w:t>
+        <w:t> [cs.LG]</w:t>
       </w:r>
       <w:r>
         <w:t> </w:t>
+      </w:r>
+    </w:p>
+    <w:p>
+      <w:r>
+        <w:t>Sashank J. Reddi, Satyen Kale &amp; Sanjiv Kumar</w:t>
+      </w:r>
+      <w:r>
+        <w:t>. “</w:t>
+      </w:r>
+      <w:r>
+        <w:t>ON THE CONVERGENCE OF ADAM AND BEYOND</w:t>
+      </w:r>
+      <w:r>
+        <w:t xml:space="preserve">”, </w:t>
+      </w:r>
+      <w:r>
+        <w:t> </w:t>
+      </w:r>
+      <w:hyperlink r:id="rId16" w:history="1">
+        <w:r>
+          <w:rPr>
+            <w:rStyle w:val="Hyperlink"/>
+          </w:rPr>
+          <w:t>arXiv:1904.09237v1</w:t>
+        </w:r>
+      </w:hyperlink>
+      <w:r>
+        <w:rPr>
+          <w:b/>
+          <w:bCs/>
+        </w:rPr>
+        <w:t> [cs.LG]</w:t>
       </w:r>
     </w:p>
     <w:p/>

</xml_diff>